<commit_message>
Build paper (BUILD_INFO records the source commit)
</commit_message>
<xml_diff>
--- a/paper/build/appendix.docx
+++ b/paper/build/appendix.docx
@@ -57415,7 +57415,7 @@
         <w:pStyle w:val="BodyText"/>
       </w:pPr>
       <w:r>
-        <w:t xml:space="preserve">Lee, Dong-han (2026) [9회 지선 특집] 부동산과 수도권 읍면동 표심 분석 [Ninth local elections: Real estate and voting patterns in the capital region’s eups, myeons and dongs].</w:t>
+        <w:t xml:space="preserve">Lee, Dong-han (2026) [9hoe jiseon teukjip] budongsangwa sudogwon eummyeondong pyosim bunseok (Ninth local elections: Real estate and voting patterns in the capital region’s eups, myeons and dongs).</w:t>
       </w:r>
       <w:r>
         <w:t xml:space="preserve"> </w:t>
@@ -57425,7 +57425,7 @@
           <w:iCs/>
           <w:i/>
         </w:rPr>
-        <w:t xml:space="preserve">한국리서치 여론속의 여론 [Hankook Research: Public Opinion within Public Opinion]</w:t>
+        <w:t xml:space="preserve">Hankook Research: Public Opinion within Public Opinion</w:t>
       </w:r>
       <w:r>
         <w:t xml:space="preserve">, 10 June. Research note [in Korean]. Available at:</w:t>
@@ -57453,7 +57453,7 @@
         <w:pStyle w:val="BodyText"/>
       </w:pPr>
       <w:r>
-        <w:t xml:space="preserve">Ministry of Land, Infrastructure and Transport (2026) 국토교통부_아파트 매매 실거래가 상세 자료 [Apartment sale transactions, detailed records] (RTMSDataSvcAptTradeDev), monthly records for Seoul in the twelve months before each election studied (December 2011 to May 2026). Public Data Portal [in Korean]. Available at:</w:t>
+        <w:t xml:space="preserve">Ministry of Land, Infrastructure and Transport (2026) Apartment sale transactions, detailed records (RTMSDataSvcAptTradeDev), monthly records for Seoul in the twelve months before each election studied (December 2011 to May 2026). Public Data Portal [in Korean]. Available at:</w:t>
       </w:r>
       <w:r>
         <w:t xml:space="preserve"> </w:t>
@@ -57552,7 +57552,7 @@
         <w:pStyle w:val="BodyText"/>
       </w:pPr>
       <w:r>
-        <w:t xml:space="preserve">National Election Commission (n.d.) 공직선거관리규칙 [Regulations on Public Official Elections], Articles 86(3) and 133(3), in the versions in force at each election studied; Article 86(3) as amended 24 December 2015 and Article 133(3) as amended 9 March 2018. Korean Law Information Center [in Korean]. Available at:</w:t>
+        <w:t xml:space="preserve">National Election Commission (n.d.) Regulations on Public Official Elections, Articles 86(3) and 133(3), in the versions in force at each election studied; Article 86(3) as amended 24 December 2015 and Article 133(3) as amended 9 March 2018. Korean Law Information Center [in Korean]. Available at:</w:t>
       </w:r>
       <w:r>
         <w:t xml:space="preserve"> </w:t>
@@ -57625,7 +57625,7 @@
           <w:iCs/>
           <w:i/>
         </w:rPr>
-        <w:t xml:space="preserve">서울 생활이동 데이터, 행정동 단위 [Seoul Living Mobility: Administrative-dong data]</w:t>
+        <w:t xml:space="preserve">Seoul Living Mobility: Administrative-dong data</w:t>
       </w:r>
       <w:r>
         <w:t xml:space="preserve">. Seoul Open Data Plaza [in Korean]. Available at:</w:t>

</xml_diff>